<commit_message>
docs(pr): SEO keyword backlinks (compress PDF, merge PDF) + EIN submission details
Two keyword-anchored deep links to the highest-volume live tools, plus a
submission cheat-sheet (title, summary, keywords, category, distribution). .docx
regenerated with the links as real clickable hyperlinks.

Co-Authored-By: Claude Opus 4.8 <noreply@anthropic.com>
</commit_message>
<xml_diff>
--- a/diemdesk-EIN-newswire/press-release.docx
+++ b/diemdesk-EIN-newswire/press-release.docx
@@ -85,7 +85,43 @@
           <w:sz w:val="22"/>
           <w:szCs w:val="22"/>
         </w:rPr>
-        <w:t xml:space="preserve">The toolkit covers everyday needs: compress, convert, merge, split, rotate, edit, e-sign, and redact PDFs, plus image resizing and conversion, QR codes, and other utilities. Every in-browser tool is free and unlimited, with no ads, no watermarks, and no account required.</w:t>
+        <w:t xml:space="preserve">The toolkit covers everyday needs — from tools to </w:t>
+      </w:r>
+      <w:hyperlink w:history="1" r:id="rId6cgliznhrjer-oewpxb35">
+        <w:r>
+          <w:rPr>
+            <w:color w:val="0563C1"/>
+            <w:sz w:val="22"/>
+            <w:szCs w:val="22"/>
+            <w:u w:val="single"/>
+          </w:rPr>
+          <w:t xml:space="preserve">compress PDF</w:t>
+        </w:r>
+      </w:hyperlink>
+      <w:r>
+        <w:rPr>
+          <w:sz w:val="22"/>
+          <w:szCs w:val="22"/>
+        </w:rPr>
+        <w:t xml:space="preserve"> files and </w:t>
+      </w:r>
+      <w:hyperlink w:history="1" r:id="rIdrylbb7zdwtmcel0i5j9fo">
+        <w:r>
+          <w:rPr>
+            <w:color w:val="0563C1"/>
+            <w:sz w:val="22"/>
+            <w:szCs w:val="22"/>
+            <w:u w:val="single"/>
+          </w:rPr>
+          <w:t xml:space="preserve">merge PDF</w:t>
+        </w:r>
+      </w:hyperlink>
+      <w:r>
+        <w:rPr>
+          <w:sz w:val="22"/>
+          <w:szCs w:val="22"/>
+        </w:rPr>
+        <w:t xml:space="preserve"> documents to convert, split, rotate, edit, e-sign, and redact — plus image resizing and conversion, QR codes, and other utilities. Every in-browser tool is free and unlimited, with no ads, no watermarks, and no account required.</w:t>
       </w:r>
     </w:p>
     <w:p>
@@ -300,7 +336,43 @@
           <w:sz w:val="22"/>
           <w:szCs w:val="22"/>
         </w:rPr>
-        <w:t xml:space="preserve">Most popular online PDF tools send your file to their servers to do the work. DiemDesk does it locally, on your own computer — which keeps private documents private and lets the tools run quickly on large files. You can compress, convert, merge, split, edit, sign, and redact PDFs, resize and convert images, generate QR codes, and more — all free, with no ads or watermarks.</w:t>
+        <w:t xml:space="preserve">Most popular online PDF tools send your file to their servers to do the work. DiemDesk does it locally, on your own computer — which keeps private documents private and lets the tools run quickly on large files. You can </w:t>
+      </w:r>
+      <w:hyperlink w:history="1" r:id="rIdgopoipd4cu7qrz0hn0mwv">
+        <w:r>
+          <w:rPr>
+            <w:color w:val="0563C1"/>
+            <w:sz w:val="22"/>
+            <w:szCs w:val="22"/>
+            <w:u w:val="single"/>
+          </w:rPr>
+          <w:t xml:space="preserve">compress PDF</w:t>
+        </w:r>
+      </w:hyperlink>
+      <w:r>
+        <w:rPr>
+          <w:sz w:val="22"/>
+          <w:szCs w:val="22"/>
+        </w:rPr>
+        <w:t xml:space="preserve"> files, </w:t>
+      </w:r>
+      <w:hyperlink w:history="1" r:id="rId6y08wzaw5ewkutp9sanju">
+        <w:r>
+          <w:rPr>
+            <w:color w:val="0563C1"/>
+            <w:sz w:val="22"/>
+            <w:szCs w:val="22"/>
+            <w:u w:val="single"/>
+          </w:rPr>
+          <w:t xml:space="preserve">merge PDF</w:t>
+        </w:r>
+      </w:hyperlink>
+      <w:r>
+        <w:rPr>
+          <w:sz w:val="22"/>
+          <w:szCs w:val="22"/>
+        </w:rPr>
+        <w:t xml:space="preserve"> documents, convert, split, edit, sign, and redact PDFs, resize and convert images, generate QR codes, and more — all free, with no ads or watermarks.</w:t>
       </w:r>
     </w:p>
     <w:p>

</xml_diff>